<commit_message>
Opgave 11 - Scenario Testing
</commit_message>
<xml_diff>
--- a/Assignment/Documentation/ScenarioTest/Test - Scenatio-Testing.docx
+++ b/Assignment/Documentation/ScenarioTest/Test - Scenatio-Testing.docx
@@ -24,7 +24,7 @@
           <w:i/>
           <w:iCs/>
         </w:rPr>
-        <w:t>P1</w:t>
+        <w:t>P1 =</w:t>
       </w:r>
       <w:r>
         <w:rPr>
@@ -32,23 +32,7 @@
           <w:i/>
           <w:iCs/>
         </w:rPr>
-        <w:t xml:space="preserve"> =</w:t>
-      </w:r>
-      <w:r>
-        <w:rPr>
-          <w:rFonts w:ascii="Arial" w:hAnsi="Arial" w:cs="Arial"/>
-          <w:i/>
-          <w:iCs/>
-        </w:rPr>
-        <w:t xml:space="preserve"> </w:t>
-      </w:r>
-      <w:r>
-        <w:rPr>
-          <w:rFonts w:ascii="Arial" w:hAnsi="Arial" w:cs="Arial"/>
-          <w:i/>
-          <w:iCs/>
-        </w:rPr>
-        <w:t>Application is launched, market is initialized, the single portfolio is loaded</w:t>
+        <w:t xml:space="preserve"> Application is launched, market is initialized, the single portfolio is loaded</w:t>
       </w:r>
     </w:p>
     <w:p>
@@ -204,12 +188,12 @@
         <w:tblLook w:val="04A0" w:firstRow="1" w:lastRow="0" w:firstColumn="1" w:lastColumn="0" w:noHBand="0" w:noVBand="1"/>
       </w:tblPr>
       <w:tblGrid>
-        <w:gridCol w:w="910"/>
+        <w:gridCol w:w="909"/>
         <w:gridCol w:w="2306"/>
         <w:gridCol w:w="767"/>
         <w:gridCol w:w="4511"/>
-        <w:gridCol w:w="3805"/>
-        <w:gridCol w:w="1190"/>
+        <w:gridCol w:w="3807"/>
+        <w:gridCol w:w="1189"/>
       </w:tblGrid>
       <w:tr>
         <w:trPr>
@@ -408,8 +392,16 @@
             <w:pPr>
               <w:rPr>
                 <w:rFonts w:ascii="Arial" w:hAnsi="Arial" w:cs="Arial"/>
-              </w:rPr>
-            </w:pPr>
+                <w:lang w:val="da-DK"/>
+              </w:rPr>
+            </w:pPr>
+            <w:r>
+              <w:rPr>
+                <w:rFonts w:ascii="Arial" w:hAnsi="Arial" w:cs="Arial"/>
+                <w:lang w:val="da-DK"/>
+              </w:rPr>
+              <w:t>As expected</w:t>
+            </w:r>
           </w:p>
         </w:tc>
         <w:tc>
@@ -518,6 +510,13 @@
                 <w:rFonts w:ascii="Arial" w:hAnsi="Arial" w:cs="Arial"/>
               </w:rPr>
             </w:pPr>
+            <w:r>
+              <w:rPr>
+                <w:rFonts w:ascii="Arial" w:hAnsi="Arial" w:cs="Arial"/>
+                <w:lang w:val="da-DK"/>
+              </w:rPr>
+              <w:t>As expected</w:t>
+            </w:r>
           </w:p>
         </w:tc>
         <w:tc>
@@ -626,6 +625,13 @@
                 <w:rFonts w:ascii="Arial" w:hAnsi="Arial" w:cs="Arial"/>
               </w:rPr>
             </w:pPr>
+            <w:r>
+              <w:rPr>
+                <w:rFonts w:ascii="Arial" w:hAnsi="Arial" w:cs="Arial"/>
+                <w:lang w:val="da-DK"/>
+              </w:rPr>
+              <w:t>As expected</w:t>
+            </w:r>
           </w:p>
         </w:tc>
         <w:tc>
@@ -752,6 +758,13 @@
                 <w:rFonts w:ascii="Arial" w:hAnsi="Arial" w:cs="Arial"/>
               </w:rPr>
             </w:pPr>
+            <w:r>
+              <w:rPr>
+                <w:rFonts w:ascii="Arial" w:hAnsi="Arial" w:cs="Arial"/>
+                <w:lang w:val="da-DK"/>
+              </w:rPr>
+              <w:t>As expected</w:t>
+            </w:r>
           </w:p>
         </w:tc>
         <w:tc>
@@ -908,6 +921,13 @@
                 <w:rFonts w:ascii="Arial" w:hAnsi="Arial" w:cs="Arial"/>
               </w:rPr>
             </w:pPr>
+            <w:r>
+              <w:rPr>
+                <w:rFonts w:ascii="Arial" w:hAnsi="Arial" w:cs="Arial"/>
+                <w:lang w:val="da-DK"/>
+              </w:rPr>
+              <w:t>As expected</w:t>
+            </w:r>
           </w:p>
         </w:tc>
         <w:tc>
@@ -1016,6 +1036,13 @@
                 <w:rFonts w:ascii="Arial" w:hAnsi="Arial" w:cs="Arial"/>
               </w:rPr>
             </w:pPr>
+            <w:r>
+              <w:rPr>
+                <w:rFonts w:ascii="Arial" w:hAnsi="Arial" w:cs="Arial"/>
+                <w:lang w:val="da-DK"/>
+              </w:rPr>
+              <w:t>As expected</w:t>
+            </w:r>
           </w:p>
         </w:tc>
         <w:tc>
@@ -1382,6 +1409,13 @@
                 <w:rFonts w:ascii="Arial" w:hAnsi="Arial" w:cs="Arial"/>
               </w:rPr>
             </w:pPr>
+            <w:r>
+              <w:rPr>
+                <w:rFonts w:ascii="Arial" w:hAnsi="Arial" w:cs="Arial"/>
+                <w:lang w:val="da-DK"/>
+              </w:rPr>
+              <w:t>As expected</w:t>
+            </w:r>
           </w:p>
         </w:tc>
         <w:tc>
@@ -1490,6 +1524,13 @@
                 <w:rFonts w:ascii="Arial" w:hAnsi="Arial" w:cs="Arial"/>
               </w:rPr>
             </w:pPr>
+            <w:r>
+              <w:rPr>
+                <w:rFonts w:ascii="Arial" w:hAnsi="Arial" w:cs="Arial"/>
+                <w:lang w:val="da-DK"/>
+              </w:rPr>
+              <w:t>As expected</w:t>
+            </w:r>
           </w:p>
         </w:tc>
         <w:tc>
@@ -1598,6 +1639,13 @@
                 <w:rFonts w:ascii="Arial" w:hAnsi="Arial" w:cs="Arial"/>
               </w:rPr>
             </w:pPr>
+            <w:r>
+              <w:rPr>
+                <w:rFonts w:ascii="Arial" w:hAnsi="Arial" w:cs="Arial"/>
+                <w:lang w:val="da-DK"/>
+              </w:rPr>
+              <w:t>As expected</w:t>
+            </w:r>
           </w:p>
         </w:tc>
         <w:tc>
@@ -1706,6 +1754,13 @@
                 <w:rFonts w:ascii="Arial" w:hAnsi="Arial" w:cs="Arial"/>
               </w:rPr>
             </w:pPr>
+            <w:r>
+              <w:rPr>
+                <w:rFonts w:ascii="Arial" w:hAnsi="Arial" w:cs="Arial"/>
+                <w:lang w:val="da-DK"/>
+              </w:rPr>
+              <w:t>As expected</w:t>
+            </w:r>
           </w:p>
         </w:tc>
         <w:tc>
@@ -1814,6 +1869,13 @@
                 <w:rFonts w:ascii="Arial" w:hAnsi="Arial" w:cs="Arial"/>
               </w:rPr>
             </w:pPr>
+            <w:r>
+              <w:rPr>
+                <w:rFonts w:ascii="Arial" w:hAnsi="Arial" w:cs="Arial"/>
+                <w:lang w:val="da-DK"/>
+              </w:rPr>
+              <w:t>As expected</w:t>
+            </w:r>
           </w:p>
         </w:tc>
         <w:tc>
@@ -1922,6 +1984,13 @@
                 <w:rFonts w:ascii="Arial" w:hAnsi="Arial" w:cs="Arial"/>
               </w:rPr>
             </w:pPr>
+            <w:r>
+              <w:rPr>
+                <w:rFonts w:ascii="Arial" w:hAnsi="Arial" w:cs="Arial"/>
+                <w:lang w:val="da-DK"/>
+              </w:rPr>
+              <w:t>As expected</w:t>
+            </w:r>
           </w:p>
         </w:tc>
         <w:tc>
@@ -1976,25 +2045,7 @@
         <w:rPr>
           <w:rFonts w:ascii="Arial" w:hAnsi="Arial" w:cs="Arial"/>
         </w:rPr>
-        <w:t>-UC</w:t>
-      </w:r>
-      <w:r>
-        <w:rPr>
-          <w:rFonts w:ascii="Arial" w:hAnsi="Arial" w:cs="Arial"/>
-        </w:rPr>
-        <w:t>2</w:t>
-      </w:r>
-      <w:r>
-        <w:rPr>
-          <w:rFonts w:ascii="Arial" w:hAnsi="Arial" w:cs="Arial"/>
-        </w:rPr>
-        <w:t>-0</w:t>
-      </w:r>
-      <w:r>
-        <w:rPr>
-          <w:rFonts w:ascii="Arial" w:hAnsi="Arial" w:cs="Arial"/>
-        </w:rPr>
-        <w:t>1</w:t>
+        <w:t>-UC2-01</w:t>
       </w:r>
     </w:p>
     <w:p>
@@ -2335,6 +2386,13 @@
                 <w:rFonts w:ascii="Arial" w:hAnsi="Arial" w:cs="Arial"/>
               </w:rPr>
             </w:pPr>
+            <w:r>
+              <w:rPr>
+                <w:rFonts w:ascii="Arial" w:hAnsi="Arial" w:cs="Arial"/>
+                <w:lang w:val="da-DK"/>
+              </w:rPr>
+              <w:t>As expected</w:t>
+            </w:r>
           </w:p>
         </w:tc>
         <w:tc>
@@ -2443,6 +2501,13 @@
                 <w:rFonts w:ascii="Arial" w:hAnsi="Arial" w:cs="Arial"/>
               </w:rPr>
             </w:pPr>
+            <w:r>
+              <w:rPr>
+                <w:rFonts w:ascii="Arial" w:hAnsi="Arial" w:cs="Arial"/>
+                <w:lang w:val="da-DK"/>
+              </w:rPr>
+              <w:t>As expected</w:t>
+            </w:r>
           </w:p>
         </w:tc>
         <w:tc>
@@ -2551,6 +2616,13 @@
                 <w:rFonts w:ascii="Arial" w:hAnsi="Arial" w:cs="Arial"/>
               </w:rPr>
             </w:pPr>
+            <w:r>
+              <w:rPr>
+                <w:rFonts w:ascii="Arial" w:hAnsi="Arial" w:cs="Arial"/>
+                <w:lang w:val="da-DK"/>
+              </w:rPr>
+              <w:t>As expected</w:t>
+            </w:r>
           </w:p>
         </w:tc>
         <w:tc>
@@ -2659,6 +2731,13 @@
                 <w:rFonts w:ascii="Arial" w:hAnsi="Arial" w:cs="Arial"/>
               </w:rPr>
             </w:pPr>
+            <w:r>
+              <w:rPr>
+                <w:rFonts w:ascii="Arial" w:hAnsi="Arial" w:cs="Arial"/>
+                <w:lang w:val="da-DK"/>
+              </w:rPr>
+              <w:t>As expected</w:t>
+            </w:r>
           </w:p>
         </w:tc>
         <w:tc>
@@ -2753,21 +2832,7 @@
               <w:rPr>
                 <w:rFonts w:ascii="Arial" w:hAnsi="Arial" w:cs="Arial"/>
               </w:rPr>
-              <w:t xml:space="preserve">System shows </w:t>
-            </w:r>
-            <w:proofErr w:type="gramStart"/>
-            <w:r>
-              <w:rPr>
-                <w:rFonts w:ascii="Arial" w:hAnsi="Arial" w:cs="Arial"/>
-              </w:rPr>
-              <w:t>owned</w:t>
-            </w:r>
-            <w:proofErr w:type="gramEnd"/>
-            <w:r>
-              <w:rPr>
-                <w:rFonts w:ascii="Arial" w:hAnsi="Arial" w:cs="Arial"/>
-              </w:rPr>
-              <w:t xml:space="preserve"> TSLA shares minus </w:t>
+              <w:t xml:space="preserve">System shows owned TSLA shares minus </w:t>
             </w:r>
             <w:r>
               <w:rPr>
@@ -2793,6 +2858,13 @@
                 <w:rFonts w:ascii="Arial" w:hAnsi="Arial" w:cs="Arial"/>
               </w:rPr>
             </w:pPr>
+            <w:r>
+              <w:rPr>
+                <w:rFonts w:ascii="Arial" w:hAnsi="Arial" w:cs="Arial"/>
+                <w:lang w:val="da-DK"/>
+              </w:rPr>
+              <w:t>As expected</w:t>
+            </w:r>
           </w:p>
         </w:tc>
         <w:tc>
@@ -2901,6 +2973,13 @@
                 <w:rFonts w:ascii="Arial" w:hAnsi="Arial" w:cs="Arial"/>
               </w:rPr>
             </w:pPr>
+            <w:r>
+              <w:rPr>
+                <w:rFonts w:ascii="Arial" w:hAnsi="Arial" w:cs="Arial"/>
+                <w:lang w:val="da-DK"/>
+              </w:rPr>
+              <w:t>As expected</w:t>
+            </w:r>
           </w:p>
         </w:tc>
         <w:tc>
@@ -2957,19 +3036,7 @@
         <w:rPr>
           <w:rFonts w:ascii="Arial" w:hAnsi="Arial" w:cs="Arial"/>
         </w:rPr>
-        <w:t>-UC</w:t>
-      </w:r>
-      <w:r>
-        <w:rPr>
-          <w:rFonts w:ascii="Arial" w:hAnsi="Arial" w:cs="Arial"/>
-        </w:rPr>
-        <w:t>2</w:t>
-      </w:r>
-      <w:r>
-        <w:rPr>
-          <w:rFonts w:ascii="Arial" w:hAnsi="Arial" w:cs="Arial"/>
-        </w:rPr>
-        <w:t>-02</w:t>
+        <w:t>-UC2-02</w:t>
       </w:r>
     </w:p>
     <w:p>
@@ -3292,6 +3359,13 @@
                 <w:rFonts w:ascii="Arial" w:hAnsi="Arial" w:cs="Arial"/>
               </w:rPr>
             </w:pPr>
+            <w:r>
+              <w:rPr>
+                <w:rFonts w:ascii="Arial" w:hAnsi="Arial" w:cs="Arial"/>
+                <w:lang w:val="da-DK"/>
+              </w:rPr>
+              <w:t>As expected</w:t>
+            </w:r>
           </w:p>
         </w:tc>
         <w:tc>
@@ -3400,6 +3474,13 @@
                 <w:rFonts w:ascii="Arial" w:hAnsi="Arial" w:cs="Arial"/>
               </w:rPr>
             </w:pPr>
+            <w:r>
+              <w:rPr>
+                <w:rFonts w:ascii="Arial" w:hAnsi="Arial" w:cs="Arial"/>
+                <w:lang w:val="da-DK"/>
+              </w:rPr>
+              <w:t>As expected</w:t>
+            </w:r>
           </w:p>
         </w:tc>
         <w:tc>
@@ -3508,6 +3589,13 @@
                 <w:rFonts w:ascii="Arial" w:hAnsi="Arial" w:cs="Arial"/>
               </w:rPr>
             </w:pPr>
+            <w:r>
+              <w:rPr>
+                <w:rFonts w:ascii="Arial" w:hAnsi="Arial" w:cs="Arial"/>
+                <w:lang w:val="da-DK"/>
+              </w:rPr>
+              <w:t>As expected</w:t>
+            </w:r>
           </w:p>
         </w:tc>
         <w:tc>
@@ -3616,6 +3704,13 @@
                 <w:rFonts w:ascii="Arial" w:hAnsi="Arial" w:cs="Arial"/>
               </w:rPr>
             </w:pPr>
+            <w:r>
+              <w:rPr>
+                <w:rFonts w:ascii="Arial" w:hAnsi="Arial" w:cs="Arial"/>
+                <w:lang w:val="da-DK"/>
+              </w:rPr>
+              <w:t>As expected</w:t>
+            </w:r>
           </w:p>
         </w:tc>
         <w:tc>
@@ -3730,6 +3825,13 @@
                 <w:rFonts w:ascii="Arial" w:hAnsi="Arial" w:cs="Arial"/>
               </w:rPr>
             </w:pPr>
+            <w:r>
+              <w:rPr>
+                <w:rFonts w:ascii="Arial" w:hAnsi="Arial" w:cs="Arial"/>
+                <w:lang w:val="da-DK"/>
+              </w:rPr>
+              <w:t>As expected</w:t>
+            </w:r>
           </w:p>
         </w:tc>
         <w:tc>
@@ -3838,6 +3940,13 @@
                 <w:rFonts w:ascii="Arial" w:hAnsi="Arial" w:cs="Arial"/>
               </w:rPr>
             </w:pPr>
+            <w:r>
+              <w:rPr>
+                <w:rFonts w:ascii="Arial" w:hAnsi="Arial" w:cs="Arial"/>
+                <w:lang w:val="da-DK"/>
+              </w:rPr>
+              <w:t>As expected</w:t>
+            </w:r>
           </w:p>
         </w:tc>
         <w:tc>

</xml_diff>